<commit_message>
Update report with CampusShare section
</commit_message>
<xml_diff>
--- a/SDN_File_Sharing_Report_v2.docx
+++ b/SDN_File_Sharing_Report_v2.docx
@@ -451,6 +451,122 @@
                 <w:sz w:val="20"/>
                 <w:szCs w:val="20"/>
               </w:rPr>
+              <w:t xml:space="preserve">Portal API tests (t_api.py, 37 checks)</w:t>
+            </w:r>
+          </w:p>
+        </w:tc>
+        <w:tc>
+          <w:tcPr>
+            <w:tcW w:type="dxa" w:w="4800"/>
+            <w:tcBorders>
+              <w:top w:val="single" w:color="999999" w:sz="4"/>
+              <w:left w:val="single" w:color="999999" w:sz="4"/>
+              <w:bottom w:val="single" w:color="999999" w:sz="4"/>
+              <w:right w:val="single" w:color="999999" w:sz="4"/>
+            </w:tcBorders>
+            <w:tcMar>
+              <w:top w:type="dxa" w:w="60"/>
+              <w:left w:type="dxa" w:w="100"/>
+              <w:bottom w:type="dxa" w:w="60"/>
+              <w:right w:type="dxa" w:w="100"/>
+            </w:tcMar>
+          </w:tcPr>
+          <w:p>
+            <w:r>
+              <w:rPr>
+                <w:b w:val="false"/>
+                <w:bCs w:val="false"/>
+                <w:sz w:val="20"/>
+                <w:szCs w:val="20"/>
+              </w:rPr>
+              <w:t xml:space="preserve">Roles and permissions (a student cannot see other students submissions or download files the portal did not create), path-traversal and bad-name rejection, late flag, regrade clears marks, material upload and download with matching SHA-256, activity feed visibility by role, unauthenticated access refused. All passed.</w:t>
+            </w:r>
+          </w:p>
+        </w:tc>
+      </w:tr>
+      <w:tr>
+        <w:tc>
+          <w:tcPr>
+            <w:tcW w:type="dxa" w:w="4200"/>
+            <w:tcBorders>
+              <w:top w:val="single" w:color="999999" w:sz="4"/>
+              <w:left w:val="single" w:color="999999" w:sz="4"/>
+              <w:bottom w:val="single" w:color="999999" w:sz="4"/>
+              <w:right w:val="single" w:color="999999" w:sz="4"/>
+            </w:tcBorders>
+            <w:tcMar>
+              <w:top w:type="dxa" w:w="60"/>
+              <w:left w:type="dxa" w:w="100"/>
+              <w:bottom w:type="dxa" w:w="60"/>
+              <w:right w:type="dxa" w:w="100"/>
+            </w:tcMar>
+          </w:tcPr>
+          <w:p>
+            <w:r>
+              <w:rPr>
+                <w:b w:val="false"/>
+                <w:bCs w:val="false"/>
+                <w:sz w:val="20"/>
+                <w:szCs w:val="20"/>
+              </w:rPr>
+              <w:t xml:space="preserve">Portal in a browser (Playwright, Chromium)</w:t>
+            </w:r>
+          </w:p>
+        </w:tc>
+        <w:tc>
+          <w:tcPr>
+            <w:tcW w:type="dxa" w:w="4800"/>
+            <w:tcBorders>
+              <w:top w:val="single" w:color="999999" w:sz="4"/>
+              <w:left w:val="single" w:color="999999" w:sz="4"/>
+              <w:bottom w:val="single" w:color="999999" w:sz="4"/>
+              <w:right w:val="single" w:color="999999" w:sz="4"/>
+            </w:tcBorders>
+            <w:tcMar>
+              <w:top w:type="dxa" w:w="60"/>
+              <w:left w:type="dxa" w:w="100"/>
+              <w:bottom w:type="dxa" w:w="60"/>
+              <w:right w:type="dxa" w:w="100"/>
+            </w:tcMar>
+          </w:tcPr>
+          <w:p>
+            <w:r>
+              <w:rPr>
+                <w:b w:val="false"/>
+                <w:bCs w:val="false"/>
+                <w:sz w:val="20"/>
+                <w:szCs w:val="20"/>
+              </w:rPr>
+              <w:t xml:space="preserve">Login, hand-in, download with step tracking, grading, new assignment, slow-motion replay, desktop, 1000 px and phone widths, light and dark; no page errors.</w:t>
+            </w:r>
+          </w:p>
+        </w:tc>
+      </w:tr>
+      <w:tr>
+        <w:tc>
+          <w:tcPr>
+            <w:tcW w:type="dxa" w:w="4200"/>
+            <w:tcBorders>
+              <w:top w:val="single" w:color="999999" w:sz="4"/>
+              <w:left w:val="single" w:color="999999" w:sz="4"/>
+              <w:bottom w:val="single" w:color="999999" w:sz="4"/>
+              <w:right w:val="single" w:color="999999" w:sz="4"/>
+            </w:tcBorders>
+            <w:tcMar>
+              <w:top w:type="dxa" w:w="60"/>
+              <w:left w:type="dxa" w:w="100"/>
+              <w:bottom w:type="dxa" w:w="60"/>
+              <w:right w:type="dxa" w:w="100"/>
+            </w:tcMar>
+          </w:tcPr>
+          <w:p>
+            <w:r>
+              <w:rPr>
+                <w:b w:val="false"/>
+                <w:bCs w:val="false"/>
+                <w:sz w:val="20"/>
+                <w:szCs w:val="20"/>
+              </w:rPr>
               <w:t xml:space="preserve">Bandwidth monitoring</w:t>
             </w:r>
           </w:p>
@@ -1409,7 +1525,579 @@
         <w:pStyle w:val="Heading1"/>
       </w:pPr>
       <w:r>
-        <w:t xml:space="preserve">6. Testing</w:t>
+        <w:t xml:space="preserve">6. Application layer: CampusShare portal</w:t>
+      </w:r>
+    </w:p>
+    <w:p>
+      <w:pPr>
+        <w:spacing w:after="120"/>
+      </w:pPr>
+      <w:r>
+        <w:t xml:space="preserve">To show the file-sharing system working inside a real-life application, it is used as the storage and transfer engine of CampusShare, a college assignment and course-material portal. Students hand in assignments, faculty publish assignments and course materials and grade work, and an administrator oversees everything. The portal is a standard-library Python HTTP server (webapp.py) with a browser interface. It does not read or write the stored files itself: every upload and download is an ordinary TCP connection to the file server, made with the same client library (fsclient.py). The browser never speaks the socket protocol; it talks HTTP to the portal, which keeps the two layers separate.</w:t>
+      </w:r>
+    </w:p>
+    <w:p>
+      <w:pPr>
+        <w:spacing w:after="120"/>
+      </w:pPr>
+      <w:r>
+        <w:t xml:space="preserve">Request path: browser, then HTTP to the portal, then a TCP socket through the Open vSwitch (the portal host is attached to the switch as 10.0.0.254 on port 5 when topology.py is started with --web), then the file server on 10.0.0.4:5000. Because the portal traffic crosses the switch, the OS-Ken controller sees it, counts it per port and applies the same block and limit policies.</w:t>
+      </w:r>
+    </w:p>
+    <w:tbl>
+      <w:tblPr>
+        <w:tblW w:type="dxa" w:w="9000"/>
+        <w:tblBorders>
+          <w:top w:val="single" w:color="auto" w:sz="4"/>
+          <w:left w:val="single" w:color="auto" w:sz="4"/>
+          <w:bottom w:val="single" w:color="auto" w:sz="4"/>
+          <w:right w:val="single" w:color="auto" w:sz="4"/>
+          <w:insideH w:val="single" w:color="auto" w:sz="4"/>
+          <w:insideV w:val="single" w:color="auto" w:sz="4"/>
+        </w:tblBorders>
+      </w:tblPr>
+      <w:tblGrid>
+        <w:gridCol w:w="1700"/>
+        <w:gridCol w:w="2600"/>
+        <w:gridCol w:w="4700"/>
+      </w:tblGrid>
+      <w:tr>
+        <w:trPr>
+          <w:tblHeader/>
+        </w:trPr>
+        <w:tc>
+          <w:tcPr>
+            <w:tcW w:type="dxa" w:w="1700"/>
+            <w:tcBorders>
+              <w:top w:val="single" w:color="999999" w:sz="4"/>
+              <w:left w:val="single" w:color="999999" w:sz="4"/>
+              <w:bottom w:val="single" w:color="999999" w:sz="4"/>
+              <w:right w:val="single" w:color="999999" w:sz="4"/>
+            </w:tcBorders>
+            <w:shd w:fill="E8EEF4" w:color="auto" w:val="clear"/>
+            <w:tcMar>
+              <w:top w:type="dxa" w:w="60"/>
+              <w:left w:type="dxa" w:w="100"/>
+              <w:bottom w:type="dxa" w:w="60"/>
+              <w:right w:type="dxa" w:w="100"/>
+            </w:tcMar>
+          </w:tcPr>
+          <w:p>
+            <w:r>
+              <w:rPr>
+                <w:b/>
+                <w:bCs/>
+                <w:sz w:val="20"/>
+                <w:szCs w:val="20"/>
+              </w:rPr>
+              <w:t xml:space="preserve">Role</w:t>
+            </w:r>
+          </w:p>
+        </w:tc>
+        <w:tc>
+          <w:tcPr>
+            <w:tcW w:type="dxa" w:w="2600"/>
+            <w:tcBorders>
+              <w:top w:val="single" w:color="999999" w:sz="4"/>
+              <w:left w:val="single" w:color="999999" w:sz="4"/>
+              <w:bottom w:val="single" w:color="999999" w:sz="4"/>
+              <w:right w:val="single" w:color="999999" w:sz="4"/>
+            </w:tcBorders>
+            <w:shd w:fill="E8EEF4" w:color="auto" w:val="clear"/>
+            <w:tcMar>
+              <w:top w:type="dxa" w:w="60"/>
+              <w:left w:type="dxa" w:w="100"/>
+              <w:bottom w:type="dxa" w:w="60"/>
+              <w:right w:type="dxa" w:w="100"/>
+            </w:tcMar>
+          </w:tcPr>
+          <w:p>
+            <w:r>
+              <w:rPr>
+                <w:b/>
+                <w:bCs/>
+                <w:sz w:val="20"/>
+                <w:szCs w:val="20"/>
+              </w:rPr>
+              <w:t xml:space="preserve">Demo account</w:t>
+            </w:r>
+          </w:p>
+        </w:tc>
+        <w:tc>
+          <w:tcPr>
+            <w:tcW w:type="dxa" w:w="4700"/>
+            <w:tcBorders>
+              <w:top w:val="single" w:color="999999" w:sz="4"/>
+              <w:left w:val="single" w:color="999999" w:sz="4"/>
+              <w:bottom w:val="single" w:color="999999" w:sz="4"/>
+              <w:right w:val="single" w:color="999999" w:sz="4"/>
+            </w:tcBorders>
+            <w:shd w:fill="E8EEF4" w:color="auto" w:val="clear"/>
+            <w:tcMar>
+              <w:top w:type="dxa" w:w="60"/>
+              <w:left w:type="dxa" w:w="100"/>
+              <w:bottom w:type="dxa" w:w="60"/>
+              <w:right w:type="dxa" w:w="100"/>
+            </w:tcMar>
+          </w:tcPr>
+          <w:p>
+            <w:r>
+              <w:rPr>
+                <w:b/>
+                <w:bCs/>
+                <w:sz w:val="20"/>
+                <w:szCs w:val="20"/>
+              </w:rPr>
+              <w:t xml:space="preserve">What the portal allows</w:t>
+            </w:r>
+          </w:p>
+        </w:tc>
+      </w:tr>
+      <w:tr>
+        <w:tc>
+          <w:tcPr>
+            <w:tcW w:type="dxa" w:w="1700"/>
+            <w:tcBorders>
+              <w:top w:val="single" w:color="999999" w:sz="4"/>
+              <w:left w:val="single" w:color="999999" w:sz="4"/>
+              <w:bottom w:val="single" w:color="999999" w:sz="4"/>
+              <w:right w:val="single" w:color="999999" w:sz="4"/>
+            </w:tcBorders>
+            <w:tcMar>
+              <w:top w:type="dxa" w:w="60"/>
+              <w:left w:type="dxa" w:w="100"/>
+              <w:bottom w:type="dxa" w:w="60"/>
+              <w:right w:type="dxa" w:w="100"/>
+            </w:tcMar>
+          </w:tcPr>
+          <w:p>
+            <w:r>
+              <w:rPr>
+                <w:b w:val="false"/>
+                <w:bCs w:val="false"/>
+                <w:sz w:val="20"/>
+                <w:szCs w:val="20"/>
+              </w:rPr>
+              <w:t xml:space="preserve">Student</w:t>
+            </w:r>
+          </w:p>
+        </w:tc>
+        <w:tc>
+          <w:tcPr>
+            <w:tcW w:type="dxa" w:w="2600"/>
+            <w:tcBorders>
+              <w:top w:val="single" w:color="999999" w:sz="4"/>
+              <w:left w:val="single" w:color="999999" w:sz="4"/>
+              <w:bottom w:val="single" w:color="999999" w:sz="4"/>
+              <w:right w:val="single" w:color="999999" w:sz="4"/>
+            </w:tcBorders>
+            <w:tcMar>
+              <w:top w:type="dxa" w:w="60"/>
+              <w:left w:type="dxa" w:w="100"/>
+              <w:bottom w:type="dxa" w:w="60"/>
+              <w:right w:type="dxa" w:w="100"/>
+            </w:tcMar>
+          </w:tcPr>
+          <w:p>
+            <w:r>
+              <w:rPr>
+                <w:b w:val="false"/>
+                <w:bCs w:val="false"/>
+                <w:sz w:val="20"/>
+                <w:szCs w:val="20"/>
+              </w:rPr>
+              <w:t xml:space="preserve">alice, bob, carol</w:t>
+            </w:r>
+          </w:p>
+        </w:tc>
+        <w:tc>
+          <w:tcPr>
+            <w:tcW w:type="dxa" w:w="4700"/>
+            <w:tcBorders>
+              <w:top w:val="single" w:color="999999" w:sz="4"/>
+              <w:left w:val="single" w:color="999999" w:sz="4"/>
+              <w:bottom w:val="single" w:color="999999" w:sz="4"/>
+              <w:right w:val="single" w:color="999999" w:sz="4"/>
+            </w:tcBorders>
+            <w:tcMar>
+              <w:top w:type="dxa" w:w="60"/>
+              <w:left w:type="dxa" w:w="100"/>
+              <w:bottom w:type="dxa" w:w="60"/>
+              <w:right w:type="dxa" w:w="100"/>
+            </w:tcMar>
+          </w:tcPr>
+          <w:p>
+            <w:r>
+              <w:rPr>
+                <w:b w:val="false"/>
+                <w:bCs w:val="false"/>
+                <w:sz w:val="20"/>
+                <w:szCs w:val="20"/>
+              </w:rPr>
+              <w:t xml:space="preserve">See assignments and due dates, hand in and resubmit work, see own marks and feedback, download course materials</w:t>
+            </w:r>
+          </w:p>
+        </w:tc>
+      </w:tr>
+      <w:tr>
+        <w:tc>
+          <w:tcPr>
+            <w:tcW w:type="dxa" w:w="1700"/>
+            <w:tcBorders>
+              <w:top w:val="single" w:color="999999" w:sz="4"/>
+              <w:left w:val="single" w:color="999999" w:sz="4"/>
+              <w:bottom w:val="single" w:color="999999" w:sz="4"/>
+              <w:right w:val="single" w:color="999999" w:sz="4"/>
+            </w:tcBorders>
+            <w:tcMar>
+              <w:top w:type="dxa" w:w="60"/>
+              <w:left w:type="dxa" w:w="100"/>
+              <w:bottom w:type="dxa" w:w="60"/>
+              <w:right w:type="dxa" w:w="100"/>
+            </w:tcMar>
+          </w:tcPr>
+          <w:p>
+            <w:r>
+              <w:rPr>
+                <w:b w:val="false"/>
+                <w:bCs w:val="false"/>
+                <w:sz w:val="20"/>
+                <w:szCs w:val="20"/>
+              </w:rPr>
+              <w:t xml:space="preserve">Faculty</w:t>
+            </w:r>
+          </w:p>
+        </w:tc>
+        <w:tc>
+          <w:tcPr>
+            <w:tcW w:type="dxa" w:w="2600"/>
+            <w:tcBorders>
+              <w:top w:val="single" w:color="999999" w:sz="4"/>
+              <w:left w:val="single" w:color="999999" w:sz="4"/>
+              <w:bottom w:val="single" w:color="999999" w:sz="4"/>
+              <w:right w:val="single" w:color="999999" w:sz="4"/>
+            </w:tcBorders>
+            <w:tcMar>
+              <w:top w:type="dxa" w:w="60"/>
+              <w:left w:type="dxa" w:w="100"/>
+              <w:bottom w:type="dxa" w:w="60"/>
+              <w:right w:type="dxa" w:w="100"/>
+            </w:tcMar>
+          </w:tcPr>
+          <w:p>
+            <w:r>
+              <w:rPr>
+                <w:b w:val="false"/>
+                <w:bCs w:val="false"/>
+                <w:sz w:val="20"/>
+                <w:szCs w:val="20"/>
+              </w:rPr>
+              <w:t xml:space="preserve">prof</w:t>
+            </w:r>
+          </w:p>
+        </w:tc>
+        <w:tc>
+          <w:tcPr>
+            <w:tcW w:type="dxa" w:w="4700"/>
+            <w:tcBorders>
+              <w:top w:val="single" w:color="999999" w:sz="4"/>
+              <w:left w:val="single" w:color="999999" w:sz="4"/>
+              <w:bottom w:val="single" w:color="999999" w:sz="4"/>
+              <w:right w:val="single" w:color="999999" w:sz="4"/>
+            </w:tcBorders>
+            <w:tcMar>
+              <w:top w:type="dxa" w:w="60"/>
+              <w:left w:type="dxa" w:w="100"/>
+              <w:bottom w:type="dxa" w:w="60"/>
+              <w:right w:type="dxa" w:w="100"/>
+            </w:tcMar>
+          </w:tcPr>
+          <w:p>
+            <w:r>
+              <w:rPr>
+                <w:b w:val="false"/>
+                <w:bCs w:val="false"/>
+                <w:sz w:val="20"/>
+                <w:szCs w:val="20"/>
+              </w:rPr>
+              <w:t xml:space="preserve">Publish assignments with due dates, upload course materials, download every submission, grade with feedback</w:t>
+            </w:r>
+          </w:p>
+        </w:tc>
+      </w:tr>
+      <w:tr>
+        <w:tc>
+          <w:tcPr>
+            <w:tcW w:type="dxa" w:w="1700"/>
+            <w:tcBorders>
+              <w:top w:val="single" w:color="999999" w:sz="4"/>
+              <w:left w:val="single" w:color="999999" w:sz="4"/>
+              <w:bottom w:val="single" w:color="999999" w:sz="4"/>
+              <w:right w:val="single" w:color="999999" w:sz="4"/>
+            </w:tcBorders>
+            <w:tcMar>
+              <w:top w:type="dxa" w:w="60"/>
+              <w:left w:type="dxa" w:w="100"/>
+              <w:bottom w:type="dxa" w:w="60"/>
+              <w:right w:type="dxa" w:w="100"/>
+            </w:tcMar>
+          </w:tcPr>
+          <w:p>
+            <w:r>
+              <w:rPr>
+                <w:b w:val="false"/>
+                <w:bCs w:val="false"/>
+                <w:sz w:val="20"/>
+                <w:szCs w:val="20"/>
+              </w:rPr>
+              <w:t xml:space="preserve">Admin</w:t>
+            </w:r>
+          </w:p>
+        </w:tc>
+        <w:tc>
+          <w:tcPr>
+            <w:tcW w:type="dxa" w:w="2600"/>
+            <w:tcBorders>
+              <w:top w:val="single" w:color="999999" w:sz="4"/>
+              <w:left w:val="single" w:color="999999" w:sz="4"/>
+              <w:bottom w:val="single" w:color="999999" w:sz="4"/>
+              <w:right w:val="single" w:color="999999" w:sz="4"/>
+            </w:tcBorders>
+            <w:tcMar>
+              <w:top w:type="dxa" w:w="60"/>
+              <w:left w:type="dxa" w:w="100"/>
+              <w:bottom w:type="dxa" w:w="60"/>
+              <w:right w:type="dxa" w:w="100"/>
+            </w:tcMar>
+          </w:tcPr>
+          <w:p>
+            <w:r>
+              <w:rPr>
+                <w:b w:val="false"/>
+                <w:bCs w:val="false"/>
+                <w:sz w:val="20"/>
+                <w:szCs w:val="20"/>
+              </w:rPr>
+              <w:t xml:space="preserve">admin</w:t>
+            </w:r>
+          </w:p>
+        </w:tc>
+        <w:tc>
+          <w:tcPr>
+            <w:tcW w:type="dxa" w:w="4700"/>
+            <w:tcBorders>
+              <w:top w:val="single" w:color="999999" w:sz="4"/>
+              <w:left w:val="single" w:color="999999" w:sz="4"/>
+              <w:bottom w:val="single" w:color="999999" w:sz="4"/>
+              <w:right w:val="single" w:color="999999" w:sz="4"/>
+            </w:tcBorders>
+            <w:tcMar>
+              <w:top w:type="dxa" w:w="60"/>
+              <w:left w:type="dxa" w:w="100"/>
+              <w:bottom w:type="dxa" w:w="60"/>
+              <w:right w:type="dxa" w:w="100"/>
+            </w:tcMar>
+          </w:tcPr>
+          <w:p>
+            <w:r>
+              <w:rPr>
+                <w:b w:val="false"/>
+                <w:bCs w:val="false"/>
+                <w:sz w:val="20"/>
+                <w:szCs w:val="20"/>
+              </w:rPr>
+              <w:t xml:space="preserve">Everything faculty can do</w:t>
+            </w:r>
+          </w:p>
+        </w:tc>
+      </w:tr>
+    </w:tbl>
+    <w:p>
+      <w:pPr>
+        <w:spacing w:after="120"/>
+      </w:pPr>
+    </w:p>
+    <w:p>
+      <w:pPr>
+        <w:spacing w:after="120"/>
+      </w:pPr>
+      <w:r>
+        <w:rPr>
+          <w:b/>
+          <w:bCs/>
+        </w:rPr>
+        <w:t xml:space="preserve">Storage and access rules. </w:t>
+      </w:r>
+      <w:r>
+        <w:t xml:space="preserve">Files are stored on the file server as SUB_&lt;assignment&gt;_&lt;student&gt;_&lt;file&gt; for submissions and MAT_&lt;course&gt;_&lt;file&gt; for course materials; assignments, submission records and grades are kept in portal.json, written atomically under a lock. The portal enforces access on every download: a student can fetch only their own submissions and any course material, faculty and administrators can fetch any submission, and files not created by the portal cannot be reached through it. Submissions after the due date are flagged late, and a resubmission replaces the record and clears an earlier grade. Sessions are held in server memory in an HttpOnly, SameSite=Strict cookie, and file names are restricted to letters, digits, dot, underscore and hyphen.</w:t>
+      </w:r>
+    </w:p>
+    <w:p>
+      <w:pPr>
+        <w:spacing w:after="120"/>
+      </w:pPr>
+      <w:r>
+        <w:rPr>
+          <w:b/>
+          <w:bCs/>
+        </w:rPr>
+        <w:t xml:space="preserve">Making the network visible. </w:t>
+      </w:r>
+      <w:r>
+        <w:t xml:space="preserve">A Live network panel is shown beside every page. During a hand-in or download it lists each step as it happens (browser to portal, portal to file server over TCP, file server stores or returns the file) with the measured size, time and Mbit/s and, for downloads, the SHA-256 checksum. It also shows the journey of a file, live per-port traffic from the controller's stats.csv (with a 20 s peak hold, because the controller samples every 2 s), and the latest controller events (BLOCK, UNBLOCK, HOG_LIMIT) in plain sentences. A slow-motion replay animates the same steps one at a time with a short explanation of each; it replays the recorded transfer rather than slowing the real one.</w:t>
+      </w:r>
+    </w:p>
+    <w:p>
+      <w:pPr>
+        <w:spacing w:after="40" w:before="80"/>
+        <w:jc w:val="center"/>
+      </w:pPr>
+      <w:r>
+        <w:drawing>
+          <wp:inline distT="0" distB="0" distL="0" distR="0">
+            <wp:extent cx="5334000" cy="3181350"/>
+            <wp:effectExtent t="0" r="0" b="0" l="0"/>
+            <wp:docPr id="1" name="r2_student_dock.png" descr="Figure 1. Student view: a submitted assignment, with the Live network panel replaying the transfer step by step." title="Figure 1. Student view: a submitted assignment, with the Live network panel replaying the transfer step by step."/>
+            <wp:cNvGraphicFramePr>
+              <a:graphicFrameLocks xmlns:a="http://schemas.openxmlformats.org/drawingml/2006/main" noChangeAspect="1"/>
+            </wp:cNvGraphicFramePr>
+            <a:graphic xmlns:a="http://schemas.openxmlformats.org/drawingml/2006/main">
+              <a:graphicData uri="http://schemas.openxmlformats.org/drawingml/2006/picture">
+                <pic:pic xmlns:pic="http://schemas.openxmlformats.org/drawingml/2006/picture">
+                  <pic:nvPicPr>
+                    <pic:cNvPr id="0" name="" descr=""/>
+                    <pic:cNvPicPr>
+                      <a:picLocks noChangeAspect="1" noChangeArrowheads="1"/>
+                    </pic:cNvPicPr>
+                  </pic:nvPicPr>
+                  <pic:blipFill>
+                    <a:blip r:embed="rId7" cstate="none"/>
+                    <a:srcRect/>
+                    <a:stretch>
+                      <a:fillRect/>
+                    </a:stretch>
+                  </pic:blipFill>
+                  <pic:spPr bwMode="auto">
+                    <a:xfrm>
+                      <a:off x="0" y="0"/>
+                      <a:ext cx="5334000" cy="3181350"/>
+                    </a:xfrm>
+                    <a:prstGeom prst="rect">
+                      <a:avLst/>
+                    </a:prstGeom>
+                  </pic:spPr>
+                </pic:pic>
+              </a:graphicData>
+            </a:graphic>
+          </wp:inline>
+        </w:drawing>
+      </w:r>
+    </w:p>
+    <w:p>
+      <w:pPr>
+        <w:spacing w:after="160"/>
+        <w:jc w:val="center"/>
+      </w:pPr>
+      <w:r>
+        <w:rPr>
+          <w:i/>
+          <w:iCs/>
+          <w:sz w:val="18"/>
+          <w:szCs w:val="18"/>
+        </w:rPr>
+        <w:t xml:space="preserve">Figure 1. Student view: a submitted assignment, with the Live network panel replaying the transfer step by step.</w:t>
+      </w:r>
+    </w:p>
+    <w:p>
+      <w:pPr>
+        <w:spacing w:after="40" w:before="80"/>
+        <w:jc w:val="center"/>
+      </w:pPr>
+      <w:r>
+        <w:drawing>
+          <wp:inline distT="0" distB="0" distL="0" distR="0">
+            <wp:extent cx="5334000" cy="3181350"/>
+            <wp:effectExtent t="0" r="0" b="0" l="0"/>
+            <wp:docPr id="1" name="r3_faculty_review.png" descr="Figure 2. Faculty view: submissions for an assignment, with marks and feedback." title="Figure 2. Faculty view: submissions for an assignment, with marks and feedback."/>
+            <wp:cNvGraphicFramePr>
+              <a:graphicFrameLocks xmlns:a="http://schemas.openxmlformats.org/drawingml/2006/main" noChangeAspect="1"/>
+            </wp:cNvGraphicFramePr>
+            <a:graphic xmlns:a="http://schemas.openxmlformats.org/drawingml/2006/main">
+              <a:graphicData uri="http://schemas.openxmlformats.org/drawingml/2006/picture">
+                <pic:pic xmlns:pic="http://schemas.openxmlformats.org/drawingml/2006/picture">
+                  <pic:nvPicPr>
+                    <pic:cNvPr id="0" name="" descr=""/>
+                    <pic:cNvPicPr>
+                      <a:picLocks noChangeAspect="1" noChangeArrowheads="1"/>
+                    </pic:cNvPicPr>
+                  </pic:nvPicPr>
+                  <pic:blipFill>
+                    <a:blip r:embed="rId8" cstate="none"/>
+                    <a:srcRect/>
+                    <a:stretch>
+                      <a:fillRect/>
+                    </a:stretch>
+                  </pic:blipFill>
+                  <pic:spPr bwMode="auto">
+                    <a:xfrm>
+                      <a:off x="0" y="0"/>
+                      <a:ext cx="5334000" cy="3181350"/>
+                    </a:xfrm>
+                    <a:prstGeom prst="rect">
+                      <a:avLst/>
+                    </a:prstGeom>
+                  </pic:spPr>
+                </pic:pic>
+              </a:graphicData>
+            </a:graphic>
+          </wp:inline>
+        </w:drawing>
+      </w:r>
+    </w:p>
+    <w:p>
+      <w:pPr>
+        <w:spacing w:after="160"/>
+        <w:jc w:val="center"/>
+      </w:pPr>
+      <w:r>
+        <w:rPr>
+          <w:i/>
+          <w:iCs/>
+          <w:sz w:val="18"/>
+          <w:szCs w:val="18"/>
+        </w:rPr>
+        <w:t xml:space="preserve">Figure 2. Faculty view: submissions for an assignment, with marks and feedback.</w:t>
+      </w:r>
+    </w:p>
+    <w:p>
+      <w:pPr>
+        <w:spacing w:after="120"/>
+      </w:pPr>
+      <w:r>
+        <w:t xml:space="preserve">The screenshots were taken on a single test machine without Mininet, so the traffic and controller panels report no live data there; with the network running they fill from stats.csv and controller_events.log.</w:t>
+      </w:r>
+    </w:p>
+    <w:p>
+      <w:pPr>
+        <w:spacing w:after="120"/>
+      </w:pPr>
+      <w:r>
+        <w:rPr>
+          <w:b/>
+          <w:bCs/>
+        </w:rPr>
+        <w:t xml:space="preserve">SDN behaviour through the portal. </w:t>
+      </w:r>
+      <w:r>
+        <w:t xml:space="preserve">The portal gateway appears to the switch as one source address, so three failed logins through the portal block 10.0.0.254 for 30 s and every browser user is cut off until the controller logs UNBLOCK. This is the same policy as in section 4, but it also shows a limitation: blocking is per IP address, not per portal user.</w:t>
+      </w:r>
+    </w:p>
+    <w:p>
+      <w:pPr>
+        <w:pStyle w:val="Heading1"/>
+      </w:pPr>
+      <w:r>
+        <w:t xml:space="preserve">7. Testing</w:t>
       </w:r>
     </w:p>
     <w:tbl>
@@ -1776,7 +2464,7 @@
                 <w:sz w:val="20"/>
                 <w:szCs w:val="20"/>
               </w:rPr>
-              <w:t xml:space="preserve">h1 ran 4 parallel downloads while h2 ran one; only 10.0.0.1 was limited (HOG_LIMIT logged, HOG_UNLIMIT after 20 s); see section 7</w:t>
+              <w:t xml:space="preserve">h1 ran 4 parallel downloads while h2 ran one; only 10.0.0.1 was limited (HOG_LIMIT logged, HOG_UNLIMIT after 20 s); see section 8</w:t>
             </w:r>
           </w:p>
         </w:tc>
@@ -1845,7 +2533,7 @@
         <w:pStyle w:val="Heading1"/>
       </w:pPr>
       <w:r>
-        <w:t xml:space="preserve">7. Performance evaluation</w:t>
+        <w:t xml:space="preserve">8. Performance evaluation</w:t>
       </w:r>
     </w:p>
     <w:p>
@@ -3002,7 +3690,7 @@
         <w:pStyle w:val="Heading1"/>
       </w:pPr>
       <w:r>
-        <w:t xml:space="preserve">8. Issues found and fixed during development</w:t>
+        <w:t xml:space="preserve">9. Issues found and fixed during development</w:t>
       </w:r>
     </w:p>
     <w:p>
@@ -3101,7 +3789,7 @@
         <w:pStyle w:val="Heading1"/>
       </w:pPr>
       <w:r>
-        <w:t xml:space="preserve">9. Limitations and future work</w:t>
+        <w:t xml:space="preserve">10. Limitations and future work</w:t>
       </w:r>
     </w:p>
     <w:p>
@@ -3171,10 +3859,49 @@
     </w:p>
     <w:p>
       <w:pPr>
+        <w:pStyle w:val="ListParagraph"/>
+        <w:numPr>
+          <w:ilvl w:val="0"/>
+          <w:numId w:val="2"/>
+        </w:numPr>
+        <w:spacing w:after="60"/>
+      </w:pPr>
+      <w:r>
+        <w:t xml:space="preserve">The portal gateway is a single source address, so a block affects all browser users; per-user blocking would need the server to report user names and the controller to map users to flows.</w:t>
+      </w:r>
+    </w:p>
+    <w:p>
+      <w:pPr>
+        <w:pStyle w:val="ListParagraph"/>
+        <w:numPr>
+          <w:ilvl w:val="0"/>
+          <w:numId w:val="2"/>
+        </w:numPr>
+        <w:spacing w:after="60"/>
+      </w:pPr>
+      <w:r>
+        <w:t xml:space="preserve">The portal enforces access rules, but the raw file server has no access control, so the command-line client can still list and download any file. Portal sessions are in memory and traffic is plain HTTP, which is acceptable only for a local demonstration.</w:t>
+      </w:r>
+    </w:p>
+    <w:p>
+      <w:pPr>
+        <w:pStyle w:val="ListParagraph"/>
+        <w:numPr>
+          <w:ilvl w:val="0"/>
+          <w:numId w:val="2"/>
+        </w:numPr>
+        <w:spacing w:after="60"/>
+      </w:pPr>
+      <w:r>
+        <w:t xml:space="preserve">The portal does not yet support deleting assignments or signing up new users.</w:t>
+      </w:r>
+    </w:p>
+    <w:p>
+      <w:pPr>
         <w:pStyle w:val="Heading1"/>
       </w:pPr>
       <w:r>
-        <w:t xml:space="preserve">10. Reproducing the results</w:t>
+        <w:t xml:space="preserve">11. Reproducing the results</w:t>
       </w:r>
     </w:p>
     <w:p>
@@ -3182,7 +3909,7 @@
         <w:spacing w:after="120"/>
       </w:pPr>
       <w:r>
-        <w:t xml:space="preserve">Full steps are in README.md in the repository: start osken-manager controller.py, start sudo python3 topology.py, start the server on the server host, then run source exp_sdn.mn. For the limiter test, run HOG_LIMIT=1 osken-manager controller.py and source exp_hog_limit.mn (exp_hog_nolimit.mn without the variable). For the baseline, stop the controller, start topology.py --mode baseline and run source exp_baseline.mn. python3 analyze.py summarises results.csv.</w:t>
+        <w:t xml:space="preserve">Full steps are in README.md in the repository: start osken-manager controller.py, start sudo python3 topology.py, start the server on the server host, then run source exp_sdn.mn. For the limiter test, run HOG_LIMIT=1 osken-manager controller.py and source exp_hog_limit.mn (exp_hog_nolimit.mn without the variable). For the baseline, stop the controller, start topology.py --mode baseline and run source exp_baseline.mn. python3 analyze.py summarises results.csv. For the portal, start topology.py with --web, start the server inside Mininet, then run python3 webapp.py on the host and open http://localhost:8080.</w:t>
       </w:r>
     </w:p>
     <w:sectPr>

</xml_diff>